<commit_message>
Define AI abbreviation at first use
Co-Authored-By: Tatsuki Onishi <bougtoir@gmail.com>
</commit_message>
<xml_diff>
--- a/discharged_secrets_ijcip/output/Discharged_Secrets_IJCIP_manuscript.docx
+++ b/discharged_secrets_ijcip/output/Discharged_Secrets_IJCIP_manuscript.docx
@@ -3045,10 +3045,10 @@
         <w:rPr>
           <w:b/>
         </w:rPr>
-        <w:t xml:space="preserve">Declaration of generative AI in scientific writing: </w:t>
+        <w:t xml:space="preserve">Declaration of generative artificial intelligence (AI) in scientific writing: </w:t>
       </w:r>
       <w:r>
-        <w:t>Generative artificial intelligence (AI) was used to assist language editing, document formatting, and consistency checks. The author reviewed and takes responsibility for the manuscript's content, claims, and references.</w:t>
+        <w:t>Generative AI was used to assist language editing, document formatting, and consistency checks. The author reviewed and takes responsibility for the manuscript's content, claims, and references.</w:t>
       </w:r>
     </w:p>
     <w:p>

</xml_diff>